<commit_message>
Rebuild full pack with SOPs and v0.2 operating decisions
All 73 documents rebuilt as branded Word and PDF: adds 10 operations SOPs
and 11 treatment SOPs, applies the General Manager's decisions (9am-9pm,
2 Hosts per shift, Healer consultations, sound healing, no IV or wet float
at launch, branded amenities, retail, in-house laundry), fixes checklist
section references, and adds make_index.py for the README index.

Co-Authored-By: Claude Opus 5.5 <noreply@anthropic.com>
Claude-Session: https://claude.ai/code/session_01HhFEmeToeMw6KhEBL1JRcV
</commit_message>
<xml_diff>
--- a/aura-documents/output/word/01-governance/01-organisation-chart.docx
+++ b/aura-documents/output/word/01-governance/01-organisation-chart.docx
@@ -30,7 +30,7 @@
           <w:color w:val="7A6753"/>
           <w:sz w:val="16"/>
         </w:rPr>
-        <w:t xml:space="preserve">Document No. AUR-GOV-01 · Version 0.1 (Draft) · Owner: General Manager · Effective: </w:t>
+        <w:t xml:space="preserve">Document No. AUR-GOV-01 · Version 0.2 (Draft) · Owner: General Manager · Effective: </w:t>
       </w:r>
       <w:r>
         <w:rPr>
@@ -263,7 +263,7 @@
           <w:color w:val="4A3A2C"/>
           <w:sz w:val="20"/>
         </w:rPr>
-        <w:t xml:space="preserve"> — </w:t>
+        <w:t xml:space="preserve"> — 2 per shift; </w:t>
       </w:r>
       <w:r>
         <w:rPr>
@@ -283,7 +283,7 @@
           <w:color w:val="4A3A2C"/>
           <w:sz w:val="20"/>
         </w:rPr>
-        <w:t xml:space="preserve"> FTE</w:t>
+        <w:t xml:space="preserve"> FTE in total</w:t>
       </w:r>
     </w:p>
     <w:p>
@@ -299,7 +299,7 @@
           <w:color w:val="4A3A2C"/>
           <w:sz w:val="20"/>
         </w:rPr>
-        <w:t>Housekeeping / Spa Attendants</w:t>
+        <w:t>Cleaning support</w:t>
       </w:r>
       <w:r>
         <w:rPr>
@@ -319,7 +319,23 @@
           <w:color w:val="A6754C"/>
           <w:sz w:val="20"/>
         </w:rPr>
-        <w:t>[__]</w:t>
+        <w:t>[in-house attendant / outsourced cleaner — to be decided]</w:t>
+      </w:r>
+    </w:p>
+    <w:p>
+      <w:pPr>
+        <w:pStyle w:val="ListBullet2"/>
+        <w:spacing w:before="0" w:after="60" w:line="300" w:lineRule="auto"/>
+      </w:pPr>
+      <w:r>
+        <w:rPr>
+          <w:rFonts w:ascii="Jost" w:hAnsi="Jost" w:cs="Jost" w:eastAsia="Jost"/>
+          <w:b/>
+          <w:i w:val="0"/>
+          <w:color w:val="4A3A2C"/>
+          <w:sz w:val="20"/>
+        </w:rPr>
+        <w:t>Healers</w:t>
       </w:r>
       <w:r>
         <w:rPr>
@@ -329,7 +345,17 @@
           <w:color w:val="4A3A2C"/>
           <w:sz w:val="20"/>
         </w:rPr>
-        <w:t xml:space="preserve"> FTE</w:t>
+        <w:t xml:space="preserve"> (holistic / energy-healing practitioners) — </w:t>
+      </w:r>
+      <w:r>
+        <w:rPr>
+          <w:rFonts w:ascii="Jost" w:hAnsi="Jost" w:cs="Jost" w:eastAsia="Jost"/>
+          <w:b w:val="0"/>
+          <w:i w:val="0"/>
+          <w:color w:val="A6754C"/>
+          <w:sz w:val="20"/>
+        </w:rPr>
+        <w:t>[__]</w:t>
       </w:r>
     </w:p>
     <w:p>
@@ -375,33 +401,7 @@
           <w:color w:val="4A3A2C"/>
           <w:sz w:val="20"/>
         </w:rPr>
-        <w:t xml:space="preserve"> FTE</w:t>
-      </w:r>
-    </w:p>
-    <w:p>
-      <w:pPr>
-        <w:pStyle w:val="ListBullet2"/>
-        <w:spacing w:before="0" w:after="60" w:line="300" w:lineRule="auto"/>
-      </w:pPr>
-      <w:r>
-        <w:rPr>
-          <w:rFonts w:ascii="Jost" w:hAnsi="Jost" w:cs="Jost" w:eastAsia="Jost"/>
-          <w:b/>
-          <w:i w:val="0"/>
-          <w:color w:val="4A3A2C"/>
-          <w:sz w:val="20"/>
-        </w:rPr>
-        <w:t>Clinical Lead</w:t>
-      </w:r>
-      <w:r>
-        <w:rPr>
-          <w:rFonts w:ascii="Jost" w:hAnsi="Jost" w:cs="Jost" w:eastAsia="Jost"/>
-          <w:b w:val="0"/>
-          <w:i w:val="0"/>
-          <w:color w:val="4A3A2C"/>
-          <w:sz w:val="20"/>
-        </w:rPr>
-        <w:t xml:space="preserve"> (DHA-licensed nurse or physician) — </w:t>
+        <w:t xml:space="preserve"> FTE </w:t>
       </w:r>
       <w:r>
         <w:rPr>
@@ -411,53 +411,7 @@
           <w:color w:val="A6754C"/>
           <w:sz w:val="20"/>
         </w:rPr>
-        <w:t>[Name]</w:t>
-      </w:r>
-    </w:p>
-    <w:p>
-      <w:pPr>
-        <w:pStyle w:val="ListBullet2"/>
-        <w:spacing w:before="0" w:after="60" w:line="300" w:lineRule="auto"/>
-      </w:pPr>
-      <w:r>
-        <w:rPr>
-          <w:rFonts w:ascii="Jost" w:hAnsi="Jost" w:cs="Jost" w:eastAsia="Jost"/>
-          <w:b/>
-          <w:i w:val="0"/>
-          <w:color w:val="4A3A2C"/>
-          <w:sz w:val="20"/>
-        </w:rPr>
-        <w:t>Licensed clinical staff</w:t>
-      </w:r>
-      <w:r>
-        <w:rPr>
-          <w:rFonts w:ascii="Jost" w:hAnsi="Jost" w:cs="Jost" w:eastAsia="Jost"/>
-          <w:b w:val="0"/>
-          <w:i w:val="0"/>
-          <w:color w:val="4A3A2C"/>
-          <w:sz w:val="20"/>
-        </w:rPr>
-        <w:t xml:space="preserve"> (IV therapy, hyperbaric oxygen) — </w:t>
-      </w:r>
-      <w:r>
-        <w:rPr>
-          <w:rFonts w:ascii="Jost" w:hAnsi="Jost" w:cs="Jost" w:eastAsia="Jost"/>
-          <w:b w:val="0"/>
-          <w:i w:val="0"/>
-          <w:color w:val="A6754C"/>
-          <w:sz w:val="20"/>
-        </w:rPr>
-        <w:t>[__]</w:t>
-      </w:r>
-      <w:r>
-        <w:rPr>
-          <w:rFonts w:ascii="Jost" w:hAnsi="Jost" w:cs="Jost" w:eastAsia="Jost"/>
-          <w:b w:val="0"/>
-          <w:i w:val="0"/>
-          <w:color w:val="4A3A2C"/>
-          <w:sz w:val="20"/>
-        </w:rPr>
-        <w:t xml:space="preserve"> FTE / sessional</w:t>
+        <w:t>[confirm whether covered by Hosts at launch]</w:t>
       </w:r>
     </w:p>
     <w:p>
@@ -560,6 +514,52 @@
           <w:sz w:val="20"/>
         </w:rPr>
         <w:t>[Provider name]</w:t>
+      </w:r>
+    </w:p>
+    <w:p>
+      <w:pPr>
+        <w:pStyle w:val="ListBullet"/>
+        <w:spacing w:before="0" w:after="60" w:line="300" w:lineRule="auto"/>
+      </w:pPr>
+      <w:r>
+        <w:rPr>
+          <w:rFonts w:ascii="Jost" w:hAnsi="Jost" w:cs="Jost" w:eastAsia="Jost"/>
+          <w:b/>
+          <w:i w:val="0"/>
+          <w:color w:val="4A3A2C"/>
+          <w:sz w:val="20"/>
+        </w:rPr>
+        <w:t>Medical oversight (not on the floor):</w:t>
+      </w:r>
+      <w:r>
+        <w:rPr>
+          <w:rFonts w:ascii="Jost" w:hAnsi="Jost" w:cs="Jost" w:eastAsia="Jost"/>
+          <w:b w:val="0"/>
+          <w:i w:val="0"/>
+          <w:color w:val="4A3A2C"/>
+          <w:sz w:val="20"/>
+        </w:rPr>
+        <w:t xml:space="preserve"> </w:t>
+      </w:r>
+      <w:r>
+        <w:rPr>
+          <w:rFonts w:ascii="Jost" w:hAnsi="Jost" w:cs="Jost" w:eastAsia="Jost"/>
+          <w:b w:val="0"/>
+          <w:i w:val="0"/>
+          <w:color w:val="A6754C"/>
+          <w:sz w:val="20"/>
+        </w:rPr>
+        <w:t>[Medical Director named on the licence]</w:t>
+      </w:r>
+      <w:r>
+        <w:rPr>
+          <w:rFonts w:ascii="Jost" w:hAnsi="Jost" w:cs="Jost" w:eastAsia="Jost"/>
+          <w:b w:val="0"/>
+          <w:i w:val="0"/>
+          <w:color w:val="4A3A2C"/>
+          <w:sz w:val="20"/>
+        </w:rPr>
+        <w:t xml:space="preserve"> — oversight and escalation only</w:t>
       </w:r>
     </w:p>
     <w:p>
@@ -1407,7 +1407,266 @@
                 <w:color w:val="4A3A2C"/>
                 <w:sz w:val="17"/>
               </w:rPr>
-              <w:t>Guide each guest from arrival to the last exhale; run the breathing ritual; operate Elevé modalities to protocol</w:t>
+              <w:t>Guide each guest from arrival to the last exhale; run the breathing ritual; operate Elevé modalities to protocol; suggest combinations of modalities; serve refreshments</w:t>
+            </w:r>
+          </w:p>
+        </w:tc>
+        <w:tc>
+          <w:tcPr>
+            <w:tcW w:type="dxa" w:w="1882"/>
+            <w:shd w:val="clear" w:color="auto" w:fill="FBF5EE"/>
+          </w:tcPr>
+          <w:p>
+            <w:pPr>
+              <w:spacing w:before="40" w:after="40" w:line="276" w:lineRule="auto"/>
+            </w:pPr>
+            <w:r>
+              <w:rPr>
+                <w:rFonts w:ascii="Jost" w:hAnsi="Jost" w:cs="Jost" w:eastAsia="Jost"/>
+                <w:b w:val="0"/>
+                <w:i w:val="0"/>
+                <w:color w:val="4A3A2C"/>
+                <w:sz w:val="17"/>
+              </w:rPr>
+              <w:t xml:space="preserve">2 per shift; </w:t>
+            </w:r>
+            <w:r>
+              <w:rPr>
+                <w:rFonts w:ascii="Jost" w:hAnsi="Jost" w:cs="Jost" w:eastAsia="Jost"/>
+                <w:b w:val="0"/>
+                <w:i w:val="0"/>
+                <w:color w:val="A6754C"/>
+                <w:sz w:val="17"/>
+              </w:rPr>
+              <w:t>[__]</w:t>
+            </w:r>
+            <w:r>
+              <w:rPr>
+                <w:rFonts w:ascii="Jost" w:hAnsi="Jost" w:cs="Jost" w:eastAsia="Jost"/>
+                <w:b w:val="0"/>
+                <w:i w:val="0"/>
+                <w:color w:val="4A3A2C"/>
+                <w:sz w:val="17"/>
+              </w:rPr>
+              <w:t xml:space="preserve"> in total</w:t>
+            </w:r>
+          </w:p>
+        </w:tc>
+        <w:tc>
+          <w:tcPr>
+            <w:tcW w:type="dxa" w:w="1882"/>
+            <w:shd w:val="clear" w:color="auto" w:fill="FBF5EE"/>
+          </w:tcPr>
+          <w:p>
+            <w:pPr>
+              <w:spacing w:before="40" w:after="40" w:line="276" w:lineRule="auto"/>
+            </w:pPr>
+            <w:r>
+              <w:rPr>
+                <w:rFonts w:ascii="Jost" w:hAnsi="Jost" w:cs="Jost" w:eastAsia="Jost"/>
+                <w:b w:val="0"/>
+                <w:i w:val="0"/>
+                <w:color w:val="4A3A2C"/>
+                <w:sz w:val="17"/>
+              </w:rPr>
+              <w:t>Full-time / part-time</w:t>
+            </w:r>
+          </w:p>
+        </w:tc>
+      </w:tr>
+      <w:tr>
+        <w:tc>
+          <w:tcPr>
+            <w:tcW w:type="dxa" w:w="1882"/>
+          </w:tcPr>
+          <w:p>
+            <w:pPr>
+              <w:spacing w:before="40" w:after="40" w:line="276" w:lineRule="auto"/>
+            </w:pPr>
+            <w:r>
+              <w:rPr>
+                <w:rFonts w:ascii="Jost" w:hAnsi="Jost" w:cs="Jost" w:eastAsia="Jost"/>
+                <w:b w:val="0"/>
+                <w:i w:val="0"/>
+                <w:color w:val="4A3A2C"/>
+                <w:sz w:val="17"/>
+              </w:rPr>
+              <w:t>Healers</w:t>
+            </w:r>
+          </w:p>
+        </w:tc>
+        <w:tc>
+          <w:tcPr>
+            <w:tcW w:type="dxa" w:w="1882"/>
+          </w:tcPr>
+          <w:p>
+            <w:pPr>
+              <w:spacing w:before="40" w:after="40" w:line="276" w:lineRule="auto"/>
+            </w:pPr>
+            <w:r>
+              <w:rPr>
+                <w:rFonts w:ascii="Jost" w:hAnsi="Jost" w:cs="Jost" w:eastAsia="Jost"/>
+                <w:b w:val="0"/>
+                <w:i w:val="0"/>
+                <w:color w:val="4A3A2C"/>
+                <w:sz w:val="17"/>
+              </w:rPr>
+              <w:t>General Manager</w:t>
+            </w:r>
+          </w:p>
+        </w:tc>
+        <w:tc>
+          <w:tcPr>
+            <w:tcW w:type="dxa" w:w="1882"/>
+          </w:tcPr>
+          <w:p>
+            <w:pPr>
+              <w:spacing w:before="40" w:after="40" w:line="276" w:lineRule="auto"/>
+            </w:pPr>
+            <w:r>
+              <w:rPr>
+                <w:rFonts w:ascii="Jost" w:hAnsi="Jost" w:cs="Jost" w:eastAsia="Jost"/>
+                <w:b w:val="0"/>
+                <w:i w:val="0"/>
+                <w:color w:val="4A3A2C"/>
+                <w:sz w:val="17"/>
+              </w:rPr>
+              <w:t>Run every guest's first-visit consultation (</w:t>
+            </w:r>
+            <w:r>
+              <w:rPr>
+                <w:rFonts w:ascii="Jost" w:hAnsi="Jost" w:cs="Jost" w:eastAsia="Jost"/>
+                <w:b w:val="0"/>
+                <w:i w:val="0"/>
+                <w:color w:val="A6754C"/>
+                <w:sz w:val="17"/>
+              </w:rPr>
+              <w:t>[30–45 min proposed]</w:t>
+            </w:r>
+            <w:r>
+              <w:rPr>
+                <w:rFonts w:ascii="Jost" w:hAnsi="Jost" w:cs="Jost" w:eastAsia="Jost"/>
+                <w:b w:val="0"/>
+                <w:i w:val="0"/>
+                <w:color w:val="4A3A2C"/>
+                <w:sz w:val="17"/>
+              </w:rPr>
+              <w:t xml:space="preserve">); identify the core problem; design a personalised package or programme to regulate the nervous system and support energy healing; lead Sound Healing and Guided Breathwork sessions </w:t>
+            </w:r>
+            <w:r>
+              <w:rPr>
+                <w:rFonts w:ascii="Jost" w:hAnsi="Jost" w:cs="Jost" w:eastAsia="Jost"/>
+                <w:b w:val="0"/>
+                <w:i w:val="0"/>
+                <w:color w:val="A6754C"/>
+                <w:sz w:val="17"/>
+              </w:rPr>
+              <w:t>[confirm]</w:t>
+            </w:r>
+          </w:p>
+        </w:tc>
+        <w:tc>
+          <w:tcPr>
+            <w:tcW w:type="dxa" w:w="1882"/>
+          </w:tcPr>
+          <w:p>
+            <w:pPr>
+              <w:spacing w:before="40" w:after="40" w:line="276" w:lineRule="auto"/>
+            </w:pPr>
+            <w:r>
+              <w:rPr>
+                <w:rFonts w:ascii="Jost" w:hAnsi="Jost" w:cs="Jost" w:eastAsia="Jost"/>
+                <w:b w:val="0"/>
+                <w:i w:val="0"/>
+                <w:color w:val="A6754C"/>
+                <w:sz w:val="17"/>
+              </w:rPr>
+              <w:t>[__]</w:t>
+            </w:r>
+          </w:p>
+        </w:tc>
+        <w:tc>
+          <w:tcPr>
+            <w:tcW w:type="dxa" w:w="1882"/>
+          </w:tcPr>
+          <w:p>
+            <w:pPr>
+              <w:spacing w:before="40" w:after="40" w:line="276" w:lineRule="auto"/>
+            </w:pPr>
+            <w:r>
+              <w:rPr>
+                <w:rFonts w:ascii="Jost" w:hAnsi="Jost" w:cs="Jost" w:eastAsia="Jost"/>
+                <w:b w:val="0"/>
+                <w:i w:val="0"/>
+                <w:color w:val="4A3A2C"/>
+                <w:sz w:val="17"/>
+              </w:rPr>
+              <w:t>Full-time / part-time / sessional</w:t>
+            </w:r>
+          </w:p>
+        </w:tc>
+      </w:tr>
+      <w:tr>
+        <w:tc>
+          <w:tcPr>
+            <w:tcW w:type="dxa" w:w="1882"/>
+            <w:shd w:val="clear" w:color="auto" w:fill="FBF5EE"/>
+          </w:tcPr>
+          <w:p>
+            <w:pPr>
+              <w:spacing w:before="40" w:after="40" w:line="276" w:lineRule="auto"/>
+            </w:pPr>
+            <w:r>
+              <w:rPr>
+                <w:rFonts w:ascii="Jost" w:hAnsi="Jost" w:cs="Jost" w:eastAsia="Jost"/>
+                <w:b w:val="0"/>
+                <w:i w:val="0"/>
+                <w:color w:val="4A3A2C"/>
+                <w:sz w:val="17"/>
+              </w:rPr>
+              <w:t>Guest Relations / Front Desk</w:t>
+            </w:r>
+          </w:p>
+        </w:tc>
+        <w:tc>
+          <w:tcPr>
+            <w:tcW w:type="dxa" w:w="1882"/>
+            <w:shd w:val="clear" w:color="auto" w:fill="FBF5EE"/>
+          </w:tcPr>
+          <w:p>
+            <w:pPr>
+              <w:spacing w:before="40" w:after="40" w:line="276" w:lineRule="auto"/>
+            </w:pPr>
+            <w:r>
+              <w:rPr>
+                <w:rFonts w:ascii="Jost" w:hAnsi="Jost" w:cs="Jost" w:eastAsia="Jost"/>
+                <w:b w:val="0"/>
+                <w:i w:val="0"/>
+                <w:color w:val="4A3A2C"/>
+                <w:sz w:val="17"/>
+              </w:rPr>
+              <w:t>General Manager (day-to-day: Lead Host)</w:t>
+            </w:r>
+          </w:p>
+        </w:tc>
+        <w:tc>
+          <w:tcPr>
+            <w:tcW w:type="dxa" w:w="1882"/>
+            <w:shd w:val="clear" w:color="auto" w:fill="FBF5EE"/>
+          </w:tcPr>
+          <w:p>
+            <w:pPr>
+              <w:spacing w:before="40" w:after="40" w:line="276" w:lineRule="auto"/>
+            </w:pPr>
+            <w:r>
+              <w:rPr>
+                <w:rFonts w:ascii="Jost" w:hAnsi="Jost" w:cs="Jost" w:eastAsia="Jost"/>
+                <w:b w:val="0"/>
+                <w:i w:val="0"/>
+                <w:color w:val="4A3A2C"/>
+                <w:sz w:val="17"/>
+              </w:rPr>
+              <w:t>Online and WhatsApp bookings, fast response to ad-campaign leads, confirmations, memberships, founding-member list, arrivals, payments (Apple Pay, card, cash)</w:t>
             </w:r>
           </w:p>
         </w:tc>
@@ -1471,7 +1730,7 @@
                 <w:color w:val="4A3A2C"/>
                 <w:sz w:val="17"/>
               </w:rPr>
-              <w:t>Guest Relations / Front Desk</w:t>
+              <w:t>Cleaning support</w:t>
             </w:r>
           </w:p>
         </w:tc>
@@ -1491,7 +1750,7 @@
                 <w:color w:val="4A3A2C"/>
                 <w:sz w:val="17"/>
               </w:rPr>
-              <w:t>General Manager (day-to-day: Lead Host)</w:t>
+              <w:t>Lead Host</w:t>
             </w:r>
           </w:p>
         </w:tc>
@@ -1511,7 +1770,7 @@
                 <w:color w:val="4A3A2C"/>
                 <w:sz w:val="17"/>
               </w:rPr>
-              <w:t>Bookings, confirmations, memberships, founding-member list, arrivals, payments</w:t>
+              <w:t>Room turnover with the Hosts; in-house laundry of robes, Aura-branded towels and clothing; hygiene of plunge, sauna, salt cabin and treatment rooms</w:t>
             </w:r>
           </w:p>
         </w:tc>
@@ -1531,7 +1790,7 @@
                 <w:color w:val="A6754C"/>
                 <w:sz w:val="17"/>
               </w:rPr>
-              <w:t>[__]</w:t>
+              <w:t>[in-house attendant / outsourced cleaner — to be decided]</w:t>
             </w:r>
           </w:p>
         </w:tc>
@@ -1548,10 +1807,10 @@
                 <w:rFonts w:ascii="Jost" w:hAnsi="Jost" w:cs="Jost" w:eastAsia="Jost"/>
                 <w:b w:val="0"/>
                 <w:i w:val="0"/>
-                <w:color w:val="4A3A2C"/>
+                <w:color w:val="A6754C"/>
                 <w:sz w:val="17"/>
               </w:rPr>
-              <w:t>Full-time / part-time</w:t>
+              <w:t>[To be decided]</w:t>
             </w:r>
           </w:p>
         </w:tc>
@@ -1574,7 +1833,7 @@
                 <w:color w:val="4A3A2C"/>
                 <w:sz w:val="17"/>
               </w:rPr>
-              <w:t>Clinical Lead</w:t>
+              <w:t>Marketing &amp; Community</w:t>
             </w:r>
           </w:p>
         </w:tc>
@@ -1595,7 +1854,7 @@
                 <w:color w:val="4A3A2C"/>
                 <w:sz w:val="17"/>
               </w:rPr>
-              <w:t>General Manager (clinical matters: as required by DHA)</w:t>
+              <w:t>General Manager</w:t>
             </w:r>
           </w:p>
         </w:tc>
@@ -1616,7 +1875,7 @@
                 <w:color w:val="4A3A2C"/>
                 <w:sz w:val="17"/>
               </w:rPr>
-              <w:t>Clinical governance for IV nutrient therapy and hyperbaric oxygen; screening, consent, incident review</w:t>
+              <w:t>Launch event, founding members, paid ad campaigns (Meta / Instagram / Google), Instagram, partnerships, corporate wellness</w:t>
             </w:r>
           </w:p>
         </w:tc>
@@ -1658,7 +1917,7 @@
                 <w:color w:val="4A3A2C"/>
                 <w:sz w:val="17"/>
               </w:rPr>
-              <w:t>Full-time / sessional, subject to DHA requirements</w:t>
+              <w:t>Full-time or agency</w:t>
             </w:r>
           </w:p>
         </w:tc>
@@ -1680,7 +1939,7 @@
                 <w:color w:val="4A3A2C"/>
                 <w:sz w:val="17"/>
               </w:rPr>
-              <w:t>Licensed clinical staff</w:t>
+              <w:t>Finance / Admin</w:t>
             </w:r>
           </w:p>
         </w:tc>
@@ -1700,7 +1959,7 @@
                 <w:color w:val="4A3A2C"/>
                 <w:sz w:val="17"/>
               </w:rPr>
-              <w:t>Clinical Lead</w:t>
+              <w:t>General Manager (financial reporting: CEOs)</w:t>
             </w:r>
           </w:p>
         </w:tc>
@@ -1720,7 +1979,7 @@
                 <w:color w:val="4A3A2C"/>
                 <w:sz w:val="17"/>
               </w:rPr>
-              <w:t>Administer IV nutrient therapy; supervise hyperbaric sessions where required</w:t>
+              <w:t>Bookkeeping, VAT, payroll, supplier payments, licences and renewals</w:t>
             </w:r>
           </w:p>
         </w:tc>
@@ -1747,322 +2006,6 @@
         <w:tc>
           <w:tcPr>
             <w:tcW w:type="dxa" w:w="1882"/>
-          </w:tcPr>
-          <w:p>
-            <w:pPr>
-              <w:spacing w:before="40" w:after="40" w:line="276" w:lineRule="auto"/>
-            </w:pPr>
-            <w:r>
-              <w:rPr>
-                <w:rFonts w:ascii="Jost" w:hAnsi="Jost" w:cs="Jost" w:eastAsia="Jost"/>
-                <w:b w:val="0"/>
-                <w:i w:val="0"/>
-                <w:color w:val="4A3A2C"/>
-                <w:sz w:val="17"/>
-              </w:rPr>
-              <w:t>Sessional / part-time</w:t>
-            </w:r>
-          </w:p>
-        </w:tc>
-      </w:tr>
-      <w:tr>
-        <w:tc>
-          <w:tcPr>
-            <w:tcW w:type="dxa" w:w="1882"/>
-            <w:shd w:val="clear" w:color="auto" w:fill="FBF5EE"/>
-          </w:tcPr>
-          <w:p>
-            <w:pPr>
-              <w:spacing w:before="40" w:after="40" w:line="276" w:lineRule="auto"/>
-            </w:pPr>
-            <w:r>
-              <w:rPr>
-                <w:rFonts w:ascii="Jost" w:hAnsi="Jost" w:cs="Jost" w:eastAsia="Jost"/>
-                <w:b w:val="0"/>
-                <w:i w:val="0"/>
-                <w:color w:val="4A3A2C"/>
-                <w:sz w:val="17"/>
-              </w:rPr>
-              <w:t>Housekeeping / Spa Attendants</w:t>
-            </w:r>
-          </w:p>
-        </w:tc>
-        <w:tc>
-          <w:tcPr>
-            <w:tcW w:type="dxa" w:w="1882"/>
-            <w:shd w:val="clear" w:color="auto" w:fill="FBF5EE"/>
-          </w:tcPr>
-          <w:p>
-            <w:pPr>
-              <w:spacing w:before="40" w:after="40" w:line="276" w:lineRule="auto"/>
-            </w:pPr>
-            <w:r>
-              <w:rPr>
-                <w:rFonts w:ascii="Jost" w:hAnsi="Jost" w:cs="Jost" w:eastAsia="Jost"/>
-                <w:b w:val="0"/>
-                <w:i w:val="0"/>
-                <w:color w:val="4A3A2C"/>
-                <w:sz w:val="17"/>
-              </w:rPr>
-              <w:t>Lead Host</w:t>
-            </w:r>
-          </w:p>
-        </w:tc>
-        <w:tc>
-          <w:tcPr>
-            <w:tcW w:type="dxa" w:w="1882"/>
-            <w:shd w:val="clear" w:color="auto" w:fill="FBF5EE"/>
-          </w:tcPr>
-          <w:p>
-            <w:pPr>
-              <w:spacing w:before="40" w:after="40" w:line="276" w:lineRule="auto"/>
-            </w:pPr>
-            <w:r>
-              <w:rPr>
-                <w:rFonts w:ascii="Jost" w:hAnsi="Jost" w:cs="Jost" w:eastAsia="Jost"/>
-                <w:b w:val="0"/>
-                <w:i w:val="0"/>
-                <w:color w:val="4A3A2C"/>
-                <w:sz w:val="17"/>
-              </w:rPr>
-              <w:t>Room turnover, laundry of robes and towels, hygiene of float tank, plunge, sauna and salt cabin</w:t>
-            </w:r>
-          </w:p>
-        </w:tc>
-        <w:tc>
-          <w:tcPr>
-            <w:tcW w:type="dxa" w:w="1882"/>
-            <w:shd w:val="clear" w:color="auto" w:fill="FBF5EE"/>
-          </w:tcPr>
-          <w:p>
-            <w:pPr>
-              <w:spacing w:before="40" w:after="40" w:line="276" w:lineRule="auto"/>
-            </w:pPr>
-            <w:r>
-              <w:rPr>
-                <w:rFonts w:ascii="Jost" w:hAnsi="Jost" w:cs="Jost" w:eastAsia="Jost"/>
-                <w:b w:val="0"/>
-                <w:i w:val="0"/>
-                <w:color w:val="A6754C"/>
-                <w:sz w:val="17"/>
-              </w:rPr>
-              <w:t>[__]</w:t>
-            </w:r>
-          </w:p>
-        </w:tc>
-        <w:tc>
-          <w:tcPr>
-            <w:tcW w:type="dxa" w:w="1882"/>
-            <w:shd w:val="clear" w:color="auto" w:fill="FBF5EE"/>
-          </w:tcPr>
-          <w:p>
-            <w:pPr>
-              <w:spacing w:before="40" w:after="40" w:line="276" w:lineRule="auto"/>
-            </w:pPr>
-            <w:r>
-              <w:rPr>
-                <w:rFonts w:ascii="Jost" w:hAnsi="Jost" w:cs="Jost" w:eastAsia="Jost"/>
-                <w:b w:val="0"/>
-                <w:i w:val="0"/>
-                <w:color w:val="4A3A2C"/>
-                <w:sz w:val="17"/>
-              </w:rPr>
-              <w:t>Full-time / part-time</w:t>
-            </w:r>
-          </w:p>
-        </w:tc>
-      </w:tr>
-      <w:tr>
-        <w:tc>
-          <w:tcPr>
-            <w:tcW w:type="dxa" w:w="1882"/>
-          </w:tcPr>
-          <w:p>
-            <w:pPr>
-              <w:spacing w:before="40" w:after="40" w:line="276" w:lineRule="auto"/>
-            </w:pPr>
-            <w:r>
-              <w:rPr>
-                <w:rFonts w:ascii="Jost" w:hAnsi="Jost" w:cs="Jost" w:eastAsia="Jost"/>
-                <w:b w:val="0"/>
-                <w:i w:val="0"/>
-                <w:color w:val="4A3A2C"/>
-                <w:sz w:val="17"/>
-              </w:rPr>
-              <w:t>Marketing &amp; Community</w:t>
-            </w:r>
-          </w:p>
-        </w:tc>
-        <w:tc>
-          <w:tcPr>
-            <w:tcW w:type="dxa" w:w="1882"/>
-          </w:tcPr>
-          <w:p>
-            <w:pPr>
-              <w:spacing w:before="40" w:after="40" w:line="276" w:lineRule="auto"/>
-            </w:pPr>
-            <w:r>
-              <w:rPr>
-                <w:rFonts w:ascii="Jost" w:hAnsi="Jost" w:cs="Jost" w:eastAsia="Jost"/>
-                <w:b w:val="0"/>
-                <w:i w:val="0"/>
-                <w:color w:val="4A3A2C"/>
-                <w:sz w:val="17"/>
-              </w:rPr>
-              <w:t>General Manager</w:t>
-            </w:r>
-          </w:p>
-        </w:tc>
-        <w:tc>
-          <w:tcPr>
-            <w:tcW w:type="dxa" w:w="1882"/>
-          </w:tcPr>
-          <w:p>
-            <w:pPr>
-              <w:spacing w:before="40" w:after="40" w:line="276" w:lineRule="auto"/>
-            </w:pPr>
-            <w:r>
-              <w:rPr>
-                <w:rFonts w:ascii="Jost" w:hAnsi="Jost" w:cs="Jost" w:eastAsia="Jost"/>
-                <w:b w:val="0"/>
-                <w:i w:val="0"/>
-                <w:color w:val="4A3A2C"/>
-                <w:sz w:val="17"/>
-              </w:rPr>
-              <w:t>Launch event, founding members, Instagram, partnerships, corporate wellness</w:t>
-            </w:r>
-          </w:p>
-        </w:tc>
-        <w:tc>
-          <w:tcPr>
-            <w:tcW w:type="dxa" w:w="1882"/>
-          </w:tcPr>
-          <w:p>
-            <w:pPr>
-              <w:spacing w:before="40" w:after="40" w:line="276" w:lineRule="auto"/>
-            </w:pPr>
-            <w:r>
-              <w:rPr>
-                <w:rFonts w:ascii="Jost" w:hAnsi="Jost" w:cs="Jost" w:eastAsia="Jost"/>
-                <w:b w:val="0"/>
-                <w:i w:val="0"/>
-                <w:color w:val="A6754C"/>
-                <w:sz w:val="17"/>
-              </w:rPr>
-              <w:t>[__]</w:t>
-            </w:r>
-          </w:p>
-        </w:tc>
-        <w:tc>
-          <w:tcPr>
-            <w:tcW w:type="dxa" w:w="1882"/>
-          </w:tcPr>
-          <w:p>
-            <w:pPr>
-              <w:spacing w:before="40" w:after="40" w:line="276" w:lineRule="auto"/>
-            </w:pPr>
-            <w:r>
-              <w:rPr>
-                <w:rFonts w:ascii="Jost" w:hAnsi="Jost" w:cs="Jost" w:eastAsia="Jost"/>
-                <w:b w:val="0"/>
-                <w:i w:val="0"/>
-                <w:color w:val="4A3A2C"/>
-                <w:sz w:val="17"/>
-              </w:rPr>
-              <w:t>Full-time or agency</w:t>
-            </w:r>
-          </w:p>
-        </w:tc>
-      </w:tr>
-      <w:tr>
-        <w:tc>
-          <w:tcPr>
-            <w:tcW w:type="dxa" w:w="1882"/>
-            <w:shd w:val="clear" w:color="auto" w:fill="FBF5EE"/>
-          </w:tcPr>
-          <w:p>
-            <w:pPr>
-              <w:spacing w:before="40" w:after="40" w:line="276" w:lineRule="auto"/>
-            </w:pPr>
-            <w:r>
-              <w:rPr>
-                <w:rFonts w:ascii="Jost" w:hAnsi="Jost" w:cs="Jost" w:eastAsia="Jost"/>
-                <w:b w:val="0"/>
-                <w:i w:val="0"/>
-                <w:color w:val="4A3A2C"/>
-                <w:sz w:val="17"/>
-              </w:rPr>
-              <w:t>Finance / Admin</w:t>
-            </w:r>
-          </w:p>
-        </w:tc>
-        <w:tc>
-          <w:tcPr>
-            <w:tcW w:type="dxa" w:w="1882"/>
-            <w:shd w:val="clear" w:color="auto" w:fill="FBF5EE"/>
-          </w:tcPr>
-          <w:p>
-            <w:pPr>
-              <w:spacing w:before="40" w:after="40" w:line="276" w:lineRule="auto"/>
-            </w:pPr>
-            <w:r>
-              <w:rPr>
-                <w:rFonts w:ascii="Jost" w:hAnsi="Jost" w:cs="Jost" w:eastAsia="Jost"/>
-                <w:b w:val="0"/>
-                <w:i w:val="0"/>
-                <w:color w:val="4A3A2C"/>
-                <w:sz w:val="17"/>
-              </w:rPr>
-              <w:t>General Manager (financial reporting: CEOs)</w:t>
-            </w:r>
-          </w:p>
-        </w:tc>
-        <w:tc>
-          <w:tcPr>
-            <w:tcW w:type="dxa" w:w="1882"/>
-            <w:shd w:val="clear" w:color="auto" w:fill="FBF5EE"/>
-          </w:tcPr>
-          <w:p>
-            <w:pPr>
-              <w:spacing w:before="40" w:after="40" w:line="276" w:lineRule="auto"/>
-            </w:pPr>
-            <w:r>
-              <w:rPr>
-                <w:rFonts w:ascii="Jost" w:hAnsi="Jost" w:cs="Jost" w:eastAsia="Jost"/>
-                <w:b w:val="0"/>
-                <w:i w:val="0"/>
-                <w:color w:val="4A3A2C"/>
-                <w:sz w:val="17"/>
-              </w:rPr>
-              <w:t>Bookkeeping, VAT, payroll, supplier payments, licences and renewals</w:t>
-            </w:r>
-          </w:p>
-        </w:tc>
-        <w:tc>
-          <w:tcPr>
-            <w:tcW w:type="dxa" w:w="1882"/>
-            <w:shd w:val="clear" w:color="auto" w:fill="FBF5EE"/>
-          </w:tcPr>
-          <w:p>
-            <w:pPr>
-              <w:spacing w:before="40" w:after="40" w:line="276" w:lineRule="auto"/>
-            </w:pPr>
-            <w:r>
-              <w:rPr>
-                <w:rFonts w:ascii="Jost" w:hAnsi="Jost" w:cs="Jost" w:eastAsia="Jost"/>
-                <w:b w:val="0"/>
-                <w:i w:val="0"/>
-                <w:color w:val="A6754C"/>
-                <w:sz w:val="17"/>
-              </w:rPr>
-              <w:t>[__]</w:t>
-            </w:r>
-          </w:p>
-        </w:tc>
-        <w:tc>
-          <w:tcPr>
-            <w:tcW w:type="dxa" w:w="1882"/>
-            <w:shd w:val="clear" w:color="auto" w:fill="FBF5EE"/>
           </w:tcPr>
           <w:p>
             <w:pPr>
@@ -2395,27 +2338,7 @@
                 <w:color w:val="A6754C"/>
                 <w:sz w:val="17"/>
               </w:rPr>
-              <w:t>[Clinical / medical director arrangement]</w:t>
-            </w:r>
-          </w:p>
-        </w:tc>
-        <w:tc>
-          <w:tcPr>
-            <w:tcW w:type="dxa" w:w="2353"/>
-          </w:tcPr>
-          <w:p>
-            <w:pPr>
-              <w:spacing w:before="40" w:after="40" w:line="276" w:lineRule="auto"/>
-            </w:pPr>
-            <w:r>
-              <w:rPr>
-                <w:rFonts w:ascii="Jost" w:hAnsi="Jost" w:cs="Jost" w:eastAsia="Jost"/>
-                <w:b w:val="0"/>
-                <w:i w:val="0"/>
-                <w:color w:val="A6754C"/>
-                <w:sz w:val="17"/>
-              </w:rPr>
-              <w:t>[If required by DHA]</w:t>
+              <w:t>[Medical Director named on the licence]</w:t>
             </w:r>
           </w:p>
         </w:tc>
@@ -2435,7 +2358,7 @@
                 <w:color w:val="4A3A2C"/>
                 <w:sz w:val="17"/>
               </w:rPr>
-              <w:t>Clinical Lead</w:t>
+              <w:t>Doctor named on the licence; not on the floor</w:t>
             </w:r>
           </w:p>
         </w:tc>
@@ -2452,10 +2375,30 @@
                 <w:rFonts w:ascii="Jost" w:hAnsi="Jost" w:cs="Jost" w:eastAsia="Jost"/>
                 <w:b w:val="0"/>
                 <w:i w:val="0"/>
-                <w:color w:val="A6754C"/>
+                <w:color w:val="4A3A2C"/>
                 <w:sz w:val="17"/>
               </w:rPr>
-              <w:t>[Scope subject to DHA requirements]</w:t>
+              <w:t>General Manager</w:t>
+            </w:r>
+          </w:p>
+        </w:tc>
+        <w:tc>
+          <w:tcPr>
+            <w:tcW w:type="dxa" w:w="2353"/>
+          </w:tcPr>
+          <w:p>
+            <w:pPr>
+              <w:spacing w:before="40" w:after="40" w:line="276" w:lineRule="auto"/>
+            </w:pPr>
+            <w:r>
+              <w:rPr>
+                <w:rFonts w:ascii="Jost" w:hAnsi="Jost" w:cs="Jost" w:eastAsia="Jost"/>
+                <w:b w:val="0"/>
+                <w:i w:val="0"/>
+                <w:color w:val="4A3A2C"/>
+                <w:sz w:val="17"/>
+              </w:rPr>
+              <w:t>Oversight and escalation only; no medical treatments are offered at launch</w:t>
             </w:r>
           </w:p>
         </w:tc>
@@ -2465,6 +2408,26 @@
       <w:pPr>
         <w:spacing w:before="0" w:after="80" w:line="240" w:lineRule="auto"/>
       </w:pPr>
+    </w:p>
+    <w:p>
+      <w:pPr>
+        <w:shd w:val="clear" w:color="auto" w:fill="FBF5EE"/>
+        <w:pBdr>
+          <w:left w:val="single" w:sz="18" w:space="8" w:color="A6754C"/>
+        </w:pBdr>
+        <w:spacing w:before="80" w:after="160" w:line="300" w:lineRule="auto"/>
+        <w:ind w:left="170"/>
+      </w:pPr>
+      <w:r>
+        <w:rPr>
+          <w:rFonts w:ascii="Jost" w:hAnsi="Jost" w:cs="Jost" w:eastAsia="Jost"/>
+          <w:b w:val="0"/>
+          <w:i w:val="0"/>
+          <w:color w:val="4A3A2C"/>
+          <w:sz w:val="18"/>
+        </w:rPr>
+        <w:t>No clinical services are offered at launch, so there is no Clinical Lead on the floor. If clinical services (for example IV Nutrient Therapy) are added in future, subject to DHA licensing, a Clinical Lead and licensed clinical staff would be appointed and this chart updated.</w:t>
+      </w:r>
     </w:p>
     <w:p>
       <w:pPr>
@@ -2492,7 +2455,7 @@
           <w:color w:val="4A3A2C"/>
           <w:sz w:val="20"/>
         </w:rPr>
-        <w:t xml:space="preserve">The studio operates across four booking bands within </w:t>
+        <w:t xml:space="preserve">The studio is open 7 days a week, 9:00am–9:00pm, across two shifts (for example 9:00am–3:30pm and 2:30pm–9:00pm </w:t>
       </w:r>
       <w:r>
         <w:rPr>
@@ -2502,7 +2465,7 @@
           <w:color w:val="A6754C"/>
           <w:sz w:val="20"/>
         </w:rPr>
-        <w:t>[Opening hours]</w:t>
+        <w:t>[confirm]</w:t>
       </w:r>
       <w:r>
         <w:rPr>
@@ -2512,7 +2475,7 @@
           <w:color w:val="4A3A2C"/>
           <w:sz w:val="20"/>
         </w:rPr>
-        <w:t xml:space="preserve"> (suggested 8:00am–8:00pm): Morning 8–11am, Midday 11am–2pm, Afternoon 2–5pm, Evening 5–8pm.</w:t>
+        <w:t>), with a one-hour handover overlap. There is one unit of each Elevé machine, so a single unit out of service means that modality is unavailable until it is restored.</w:t>
       </w:r>
     </w:p>
     <w:tbl>
@@ -2700,10 +2663,10 @@
                 <w:rFonts w:ascii="Jost" w:hAnsi="Jost" w:cs="Jost" w:eastAsia="Jost"/>
                 <w:b w:val="0"/>
                 <w:i w:val="0"/>
-                <w:color w:val="A6754C"/>
+                <w:color w:val="4A3A2C"/>
                 <w:sz w:val="17"/>
               </w:rPr>
-              <w:t>[__]</w:t>
+              <w:t>2 (including the Shift Lead)</w:t>
             </w:r>
           </w:p>
         </w:tc>
@@ -2724,7 +2687,7 @@
                 <w:color w:val="4A3A2C"/>
                 <w:sz w:val="17"/>
               </w:rPr>
-              <w:t>Cold plunge is always host-guided; float, cryotherapy and hyperbaric sessions need a Host within reach</w:t>
+              <w:t>Cold plunge is always host-guided; dry float, cryotherapy and hyperbaric sessions need a Host within reach</w:t>
             </w:r>
           </w:p>
         </w:tc>
@@ -2746,7 +2709,7 @@
                 <w:color w:val="4A3A2C"/>
                 <w:sz w:val="17"/>
               </w:rPr>
-              <w:t>Guest Relations</w:t>
+              <w:t>Healer</w:t>
             </w:r>
           </w:p>
         </w:tc>
@@ -2786,7 +2749,7 @@
                 <w:color w:val="4A3A2C"/>
                 <w:sz w:val="17"/>
               </w:rPr>
-              <w:t>Covers arrivals and bookings</w:t>
+              <w:t>Present whenever a first-visit consultation, Sound Healing or Guided Breathwork session is booked</w:t>
             </w:r>
           </w:p>
         </w:tc>
@@ -2809,7 +2772,7 @@
                 <w:color w:val="4A3A2C"/>
                 <w:sz w:val="17"/>
               </w:rPr>
-              <w:t>Clinical staff</w:t>
+              <w:t>Guest Relations</w:t>
             </w:r>
           </w:p>
         </w:tc>
@@ -2851,7 +2814,7 @@
                 <w:color w:val="4A3A2C"/>
                 <w:sz w:val="17"/>
               </w:rPr>
-              <w:t>Required whenever IV therapy or hyperbaric oxygen is booked, subject to DHA requirements</w:t>
+              <w:t>Covers arrivals, online and WhatsApp bookings</w:t>
             </w:r>
           </w:p>
         </w:tc>
@@ -2873,7 +2836,7 @@
                 <w:color w:val="4A3A2C"/>
                 <w:sz w:val="17"/>
               </w:rPr>
-              <w:t>Housekeeping / Spa Attendant</w:t>
+              <w:t>Cleaning support</w:t>
             </w:r>
           </w:p>
         </w:tc>
@@ -2913,7 +2876,17 @@
                 <w:color w:val="4A3A2C"/>
                 <w:sz w:val="17"/>
               </w:rPr>
-              <w:t>Turnover between sessions</w:t>
+              <w:t xml:space="preserve">Turnover between sessions; </w:t>
+            </w:r>
+            <w:r>
+              <w:rPr>
+                <w:rFonts w:ascii="Jost" w:hAnsi="Jost" w:cs="Jost" w:eastAsia="Jost"/>
+                <w:b w:val="0"/>
+                <w:i w:val="0"/>
+                <w:color w:val="A6754C"/>
+                <w:sz w:val="17"/>
+              </w:rPr>
+              <w:t>[in-house attendant / outsourced cleaner — to be decided]</w:t>
             </w:r>
           </w:p>
         </w:tc>
@@ -3147,7 +3120,7 @@
                 <w:color w:val="4A3A2C"/>
                 <w:sz w:val="17"/>
               </w:rPr>
-              <w:t>Floor (Lead Host, Hosts)</w:t>
+              <w:t>Floor (Lead Host, Hosts — 2 per shift)</w:t>
             </w:r>
           </w:p>
         </w:tc>
@@ -3232,7 +3205,7 @@
                 <w:color w:val="4A3A2C"/>
                 <w:sz w:val="17"/>
               </w:rPr>
-              <w:t>Guest Relations</w:t>
+              <w:t>Healers</w:t>
             </w:r>
           </w:p>
         </w:tc>
@@ -3315,7 +3288,7 @@
                 <w:color w:val="4A3A2C"/>
                 <w:sz w:val="17"/>
               </w:rPr>
-              <w:t>Clinical</w:t>
+              <w:t>Guest Relations</w:t>
             </w:r>
           </w:p>
         </w:tc>
@@ -3400,7 +3373,7 @@
                 <w:color w:val="4A3A2C"/>
                 <w:sz w:val="17"/>
               </w:rPr>
-              <w:t>Housekeeping / Spa Attendants</w:t>
+              <w:t>Clinical (none at launch)</w:t>
             </w:r>
           </w:p>
         </w:tc>
@@ -3417,10 +3390,10 @@
                 <w:rFonts w:ascii="Jost" w:hAnsi="Jost" w:cs="Jost" w:eastAsia="Jost"/>
                 <w:b w:val="0"/>
                 <w:i w:val="0"/>
-                <w:color w:val="A6754C"/>
+                <w:color w:val="4A3A2C"/>
                 <w:sz w:val="17"/>
               </w:rPr>
-              <w:t>[__]</w:t>
+              <w:t>0</w:t>
             </w:r>
           </w:p>
         </w:tc>
@@ -3483,7 +3456,7 @@
                 <w:color w:val="4A3A2C"/>
                 <w:sz w:val="17"/>
               </w:rPr>
-              <w:t>Marketing &amp; Community</w:t>
+              <w:t>Cleaning support</w:t>
             </w:r>
           </w:p>
         </w:tc>
@@ -3568,7 +3541,7 @@
                 <w:color w:val="4A3A2C"/>
                 <w:sz w:val="17"/>
               </w:rPr>
-              <w:t>Finance / Admin</w:t>
+              <w:t>Marketing &amp; Community</w:t>
             </w:r>
           </w:p>
         </w:tc>
@@ -3646,12 +3619,12 @@
             <w:r>
               <w:rPr>
                 <w:rFonts w:ascii="Jost" w:hAnsi="Jost" w:cs="Jost" w:eastAsia="Jost"/>
-                <w:b/>
+                <w:b w:val="0"/>
                 <w:i w:val="0"/>
                 <w:color w:val="4A3A2C"/>
                 <w:sz w:val="17"/>
               </w:rPr>
-              <w:t>Total</w:t>
+              <w:t>Finance / Admin</w:t>
             </w:r>
           </w:p>
         </w:tc>
@@ -3701,6 +3674,88 @@
           <w:tcPr>
             <w:tcW w:type="dxa" w:w="2353"/>
             <w:shd w:val="clear" w:color="auto" w:fill="FBF5EE"/>
+          </w:tcPr>
+          <w:p>
+            <w:pPr>
+              <w:spacing w:before="40" w:after="40" w:line="276" w:lineRule="auto"/>
+            </w:pPr>
+            <w:r>
+              <w:rPr>
+                <w:rFonts w:ascii="Jost" w:hAnsi="Jost" w:cs="Jost" w:eastAsia="Jost"/>
+                <w:b w:val="0"/>
+                <w:i w:val="0"/>
+                <w:color w:val="A6754C"/>
+                <w:sz w:val="17"/>
+              </w:rPr>
+              <w:t>[__]</w:t>
+            </w:r>
+          </w:p>
+        </w:tc>
+      </w:tr>
+      <w:tr>
+        <w:tc>
+          <w:tcPr>
+            <w:tcW w:type="dxa" w:w="2353"/>
+          </w:tcPr>
+          <w:p>
+            <w:pPr>
+              <w:spacing w:before="40" w:after="40" w:line="276" w:lineRule="auto"/>
+            </w:pPr>
+            <w:r>
+              <w:rPr>
+                <w:rFonts w:ascii="Jost" w:hAnsi="Jost" w:cs="Jost" w:eastAsia="Jost"/>
+                <w:b/>
+                <w:i w:val="0"/>
+                <w:color w:val="4A3A2C"/>
+                <w:sz w:val="17"/>
+              </w:rPr>
+              <w:t>Total</w:t>
+            </w:r>
+          </w:p>
+        </w:tc>
+        <w:tc>
+          <w:tcPr>
+            <w:tcW w:type="dxa" w:w="2353"/>
+          </w:tcPr>
+          <w:p>
+            <w:pPr>
+              <w:spacing w:before="40" w:after="40" w:line="276" w:lineRule="auto"/>
+            </w:pPr>
+            <w:r>
+              <w:rPr>
+                <w:rFonts w:ascii="Jost" w:hAnsi="Jost" w:cs="Jost" w:eastAsia="Jost"/>
+                <w:b w:val="0"/>
+                <w:i w:val="0"/>
+                <w:color w:val="A6754C"/>
+                <w:sz w:val="17"/>
+              </w:rPr>
+              <w:t>[__]</w:t>
+            </w:r>
+          </w:p>
+        </w:tc>
+        <w:tc>
+          <w:tcPr>
+            <w:tcW w:type="dxa" w:w="2353"/>
+          </w:tcPr>
+          <w:p>
+            <w:pPr>
+              <w:spacing w:before="40" w:after="40" w:line="276" w:lineRule="auto"/>
+            </w:pPr>
+            <w:r>
+              <w:rPr>
+                <w:rFonts w:ascii="Jost" w:hAnsi="Jost" w:cs="Jost" w:eastAsia="Jost"/>
+                <w:b w:val="0"/>
+                <w:i w:val="0"/>
+                <w:color w:val="A6754C"/>
+                <w:sz w:val="17"/>
+              </w:rPr>
+              <w:t>[__]</w:t>
+            </w:r>
+          </w:p>
+        </w:tc>
+        <w:tc>
+          <w:tcPr>
+            <w:tcW w:type="dxa" w:w="2353"/>
           </w:tcPr>
           <w:p>
             <w:pPr>

</xml_diff>